<commit_message>
feat: enhance UI and unify JSON data sources
</commit_message>
<xml_diff>
--- a/System Definition.docx
+++ b/System Definition.docx
@@ -7,7 +7,13 @@
         <w:pStyle w:val="Heading1"/>
       </w:pPr>
       <w:r>
-        <w:t>System Definition: The Periodic Table of Interaction</w:t>
+        <w:t xml:space="preserve">The Periodic Table of </w:t>
+      </w:r>
+      <w:r>
+        <w:t xml:space="preserve">Human </w:t>
+      </w:r>
+      <w:r>
+        <w:t>Interaction</w:t>
       </w:r>
     </w:p>
     <w:p>
@@ -4375,6 +4381,7 @@
         <w:rPr>
           <w:b/>
           <w:bCs/>
+          <w:noProof/>
         </w:rPr>
         <w:drawing>
           <wp:inline distT="0" distB="0" distL="0" distR="0" wp14:anchorId="6EA9DF41" wp14:editId="5CC41790">
@@ -5731,53 +5738,6 @@
       <w:pPr>
         <w:spacing w:after="0"/>
       </w:pPr>
-      <w:r>
-        <w:lastRenderedPageBreak/>
-        <w:drawing>
-          <wp:inline distT="0" distB="0" distL="0" distR="0" wp14:anchorId="48C6D549" wp14:editId="7360EF76">
-            <wp:extent cx="4658264" cy="9041837"/>
-            <wp:effectExtent l="0" t="0" r="9525" b="6985"/>
-            <wp:docPr id="223149382" name="Picture 1"/>
-            <wp:cNvGraphicFramePr>
-              <a:graphicFrameLocks xmlns:a="http://schemas.openxmlformats.org/drawingml/2006/main" noChangeAspect="1"/>
-            </wp:cNvGraphicFramePr>
-            <a:graphic xmlns:a="http://schemas.openxmlformats.org/drawingml/2006/main">
-              <a:graphicData uri="http://schemas.openxmlformats.org/drawingml/2006/picture">
-                <pic:pic xmlns:pic="http://schemas.openxmlformats.org/drawingml/2006/picture">
-                  <pic:nvPicPr>
-                    <pic:cNvPr id="223149382" name=""/>
-                    <pic:cNvPicPr/>
-                  </pic:nvPicPr>
-                  <pic:blipFill rotWithShape="1">
-                    <a:blip r:embed="rId6"/>
-                    <a:srcRect b="1691"/>
-                    <a:stretch>
-                      <a:fillRect/>
-                    </a:stretch>
-                  </pic:blipFill>
-                  <pic:spPr bwMode="auto">
-                    <a:xfrm>
-                      <a:off x="0" y="0"/>
-                      <a:ext cx="4664998" cy="9054907"/>
-                    </a:xfrm>
-                    <a:prstGeom prst="rect">
-                      <a:avLst/>
-                    </a:prstGeom>
-                    <a:ln>
-                      <a:noFill/>
-                    </a:ln>
-                    <a:extLst>
-                      <a:ext uri="{53640926-AAD7-44D8-BBD7-CCE9431645EC}">
-                        <a14:shadowObscured xmlns:a14="http://schemas.microsoft.com/office/drawing/2010/main"/>
-                      </a:ext>
-                    </a:extLst>
-                  </pic:spPr>
-                </pic:pic>
-              </a:graphicData>
-            </a:graphic>
-          </wp:inline>
-        </w:drawing>
-      </w:r>
     </w:p>
     <w:sectPr>
       <w:pgSz w:w="12240" w:h="15840"/>
@@ -8264,6 +8224,7 @@
   <w:style w:type="character" w:default="1" w:styleId="DefaultParagraphFont">
     <w:name w:val="Default Paragraph Font"/>
     <w:uiPriority w:val="1"/>
+    <w:semiHidden/>
     <w:unhideWhenUsed/>
   </w:style>
   <w:style w:type="table" w:default="1" w:styleId="TableNormal">

</xml_diff>